<commit_message>
[feature]: refactor About component and styles, remove Flags context, and update monogram display
</commit_message>
<xml_diff>
--- a/public/docs/cv/cv-simple.docx
+++ b/public/docs/cv/cv-simple.docx
@@ -1256,426 +1256,20 @@
       <w:pPr>
         <w:widowControl w:val="0"/>
         <w:rPr>
+          <w:rFonts w:ascii="Tahoma" w:eastAsia="Tahoma" w:hAnsi="Tahoma" w:cs="Tahoma"/>
+          <w:bCs/>
+          <w:iCs/>
+          <w:sz w:val="20"/>
+          <w:szCs w:val="20"/>
+        </w:rPr>
+      </w:pPr>
+      <w:r>
+        <w:rPr>
           <w:rFonts w:ascii="Tahoma" w:eastAsia="Tahoma" w:hAnsi="Tahoma"/>
           <w:b/>
           <w:i/>
         </w:rPr>
-      </w:pPr>
-      <w:r>
-        <w:rPr>
-          <w:rFonts w:ascii="Tahoma" w:eastAsia="Tahoma" w:hAnsi="Tahoma"/>
-          <w:b/>
-          <w:i/>
-        </w:rPr>
         <w:t>Trayectoria</w:t>
-      </w:r>
-    </w:p>
-    <w:p>
-      <w:pPr>
-        <w:widowControl w:val="0"/>
-        <w:rPr>
-          <w:rFonts w:ascii="Tahoma" w:eastAsia="Tahoma" w:hAnsi="Tahoma"/>
-          <w:bCs/>
-          <w:iCs/>
-        </w:rPr>
-      </w:pPr>
-    </w:p>
-    <w:p>
-      <w:pPr>
-        <w:widowControl w:val="0"/>
-        <w:rPr>
-          <w:rFonts w:ascii="Tahoma" w:eastAsia="Tahoma" w:hAnsi="Tahoma" w:cs="Tahoma"/>
-          <w:b/>
-          <w:iCs/>
-          <w:sz w:val="20"/>
-          <w:szCs w:val="20"/>
-        </w:rPr>
-      </w:pPr>
-      <w:r>
-        <w:rPr>
-          <w:rFonts w:ascii="Tahoma" w:eastAsia="Tahoma" w:hAnsi="Tahoma" w:cs="Tahoma"/>
-          <w:b/>
-          <w:iCs/>
-          <w:sz w:val="20"/>
-          <w:szCs w:val="20"/>
-        </w:rPr>
-        <w:t>JNE</w:t>
-      </w:r>
-      <w:r>
-        <w:rPr>
-          <w:rFonts w:ascii="Tahoma" w:eastAsia="Tahoma" w:hAnsi="Tahoma" w:cs="Tahoma"/>
-          <w:b/>
-          <w:iCs/>
-          <w:sz w:val="20"/>
-          <w:szCs w:val="20"/>
-        </w:rPr>
-        <w:t>, Lima, Perú</w:t>
-      </w:r>
-    </w:p>
-    <w:p>
-      <w:pPr>
-        <w:widowControl w:val="0"/>
-        <w:rPr>
-          <w:rFonts w:ascii="Tahoma" w:eastAsia="Tahoma" w:hAnsi="Tahoma" w:cs="Tahoma"/>
-          <w:b/>
-          <w:bCs/>
-          <w:iCs/>
-          <w:sz w:val="20"/>
-          <w:szCs w:val="20"/>
-          <w:lang w:val="es-PE"/>
-        </w:rPr>
-      </w:pPr>
-      <w:r>
-        <w:rPr>
-          <w:rFonts w:ascii="Tahoma" w:eastAsia="Tahoma" w:hAnsi="Tahoma" w:cs="Tahoma"/>
-          <w:b/>
-          <w:bCs/>
-          <w:iCs/>
-          <w:sz w:val="20"/>
-          <w:szCs w:val="20"/>
-          <w:lang w:val="es-PE"/>
-        </w:rPr>
-        <w:t xml:space="preserve">Full Stack </w:t>
-      </w:r>
-      <w:proofErr w:type="spellStart"/>
-      <w:r>
-        <w:rPr>
-          <w:rFonts w:ascii="Tahoma" w:eastAsia="Tahoma" w:hAnsi="Tahoma" w:cs="Tahoma"/>
-          <w:b/>
-          <w:bCs/>
-          <w:iCs/>
-          <w:sz w:val="20"/>
-          <w:szCs w:val="20"/>
-          <w:lang w:val="es-PE"/>
-        </w:rPr>
-        <w:t>Developer</w:t>
-      </w:r>
-      <w:proofErr w:type="spellEnd"/>
-      <w:r>
-        <w:rPr>
-          <w:rFonts w:ascii="Tahoma" w:eastAsia="Tahoma" w:hAnsi="Tahoma" w:cs="Tahoma"/>
-          <w:b/>
-          <w:bCs/>
-          <w:iCs/>
-          <w:sz w:val="20"/>
-          <w:szCs w:val="20"/>
-          <w:lang w:val="es-PE"/>
-        </w:rPr>
-        <w:t xml:space="preserve"> .Net / Angular</w:t>
-      </w:r>
-      <w:r>
-        <w:rPr>
-          <w:rFonts w:ascii="Tahoma" w:eastAsia="Tahoma" w:hAnsi="Tahoma" w:cs="Tahoma"/>
-          <w:bCs/>
-          <w:iCs/>
-          <w:sz w:val="20"/>
-          <w:szCs w:val="20"/>
-        </w:rPr>
-        <w:t xml:space="preserve">                    </w:t>
-      </w:r>
-      <w:r>
-        <w:rPr>
-          <w:rFonts w:ascii="Tahoma" w:eastAsia="Tahoma" w:hAnsi="Tahoma" w:cs="Tahoma"/>
-          <w:bCs/>
-          <w:iCs/>
-          <w:sz w:val="20"/>
-          <w:szCs w:val="20"/>
-        </w:rPr>
-        <w:t xml:space="preserve">                               noviembre</w:t>
-      </w:r>
-      <w:r>
-        <w:rPr>
-          <w:rFonts w:ascii="Tahoma" w:eastAsia="Tahoma" w:hAnsi="Tahoma" w:cs="Tahoma"/>
-          <w:bCs/>
-          <w:iCs/>
-          <w:sz w:val="20"/>
-          <w:szCs w:val="20"/>
-        </w:rPr>
-        <w:t xml:space="preserve"> 2025 – actualidad</w:t>
-      </w:r>
-    </w:p>
-    <w:p>
-      <w:pPr>
-        <w:pStyle w:val="Prrafodelista"/>
-        <w:numPr>
-          <w:ilvl w:val="0"/>
-          <w:numId w:val="10"/>
-        </w:numPr>
-        <w:rPr>
-          <w:rFonts w:ascii="Tahoma" w:eastAsia="Tahoma" w:hAnsi="Tahoma" w:cs="Tahoma"/>
-          <w:bCs/>
-          <w:iCs/>
-          <w:sz w:val="20"/>
-          <w:szCs w:val="20"/>
-        </w:rPr>
-      </w:pPr>
-      <w:r>
-        <w:rPr>
-          <w:rFonts w:ascii="Tahoma" w:eastAsia="Tahoma" w:hAnsi="Tahoma" w:cs="Tahoma"/>
-          <w:bCs/>
-          <w:iCs/>
-          <w:sz w:val="20"/>
-          <w:szCs w:val="20"/>
-        </w:rPr>
-        <w:t xml:space="preserve">Desarrollo de </w:t>
-      </w:r>
-      <w:proofErr w:type="spellStart"/>
-      <w:r>
-        <w:rPr>
-          <w:rFonts w:ascii="Tahoma" w:eastAsia="Tahoma" w:hAnsi="Tahoma" w:cs="Tahoma"/>
-          <w:bCs/>
-          <w:iCs/>
-          <w:sz w:val="20"/>
-          <w:szCs w:val="20"/>
-        </w:rPr>
-        <w:t>APIs</w:t>
-      </w:r>
-      <w:proofErr w:type="spellEnd"/>
-      <w:r>
-        <w:rPr>
-          <w:rFonts w:ascii="Tahoma" w:eastAsia="Tahoma" w:hAnsi="Tahoma" w:cs="Tahoma"/>
-          <w:bCs/>
-          <w:iCs/>
-          <w:sz w:val="20"/>
-          <w:szCs w:val="20"/>
-        </w:rPr>
-        <w:t xml:space="preserve"> </w:t>
-      </w:r>
-      <w:proofErr w:type="spellStart"/>
-      <w:r>
-        <w:rPr>
-          <w:rFonts w:ascii="Tahoma" w:eastAsia="Tahoma" w:hAnsi="Tahoma" w:cs="Tahoma"/>
-          <w:bCs/>
-          <w:iCs/>
-          <w:sz w:val="20"/>
-          <w:szCs w:val="20"/>
-        </w:rPr>
-        <w:t>RESTful</w:t>
-      </w:r>
-      <w:proofErr w:type="spellEnd"/>
-      <w:r>
-        <w:rPr>
-          <w:rFonts w:ascii="Tahoma" w:eastAsia="Tahoma" w:hAnsi="Tahoma" w:cs="Tahoma"/>
-          <w:bCs/>
-          <w:iCs/>
-          <w:sz w:val="20"/>
-          <w:szCs w:val="20"/>
-        </w:rPr>
-        <w:t xml:space="preserve"> con .NET Framework, exponiendo servicios consumidos por módulos Angular con arquitectura por componentes.</w:t>
-      </w:r>
-    </w:p>
-    <w:p>
-      <w:pPr>
-        <w:pStyle w:val="Prrafodelista"/>
-        <w:numPr>
-          <w:ilvl w:val="0"/>
-          <w:numId w:val="10"/>
-        </w:numPr>
-        <w:rPr>
-          <w:rFonts w:ascii="Tahoma" w:eastAsia="Tahoma" w:hAnsi="Tahoma" w:cs="Tahoma"/>
-          <w:bCs/>
-          <w:iCs/>
-          <w:sz w:val="20"/>
-          <w:szCs w:val="20"/>
-        </w:rPr>
-      </w:pPr>
-      <w:r>
-        <w:rPr>
-          <w:rFonts w:ascii="Tahoma" w:eastAsia="Tahoma" w:hAnsi="Tahoma" w:cs="Tahoma"/>
-          <w:bCs/>
-          <w:iCs/>
-          <w:sz w:val="20"/>
-          <w:szCs w:val="20"/>
-        </w:rPr>
-        <w:t xml:space="preserve">Modelado y administración de base de datos Oracle: diseño de esquemas, </w:t>
-      </w:r>
-      <w:proofErr w:type="spellStart"/>
-      <w:r>
-        <w:rPr>
-          <w:rFonts w:ascii="Tahoma" w:eastAsia="Tahoma" w:hAnsi="Tahoma" w:cs="Tahoma"/>
-          <w:bCs/>
-          <w:iCs/>
-          <w:sz w:val="20"/>
-          <w:szCs w:val="20"/>
-        </w:rPr>
-        <w:t>stored</w:t>
-      </w:r>
-      <w:proofErr w:type="spellEnd"/>
-      <w:r>
-        <w:rPr>
-          <w:rFonts w:ascii="Tahoma" w:eastAsia="Tahoma" w:hAnsi="Tahoma" w:cs="Tahoma"/>
-          <w:bCs/>
-          <w:iCs/>
-          <w:sz w:val="20"/>
-          <w:szCs w:val="20"/>
-        </w:rPr>
-        <w:t xml:space="preserve"> </w:t>
-      </w:r>
-      <w:proofErr w:type="spellStart"/>
-      <w:r>
-        <w:rPr>
-          <w:rFonts w:ascii="Tahoma" w:eastAsia="Tahoma" w:hAnsi="Tahoma" w:cs="Tahoma"/>
-          <w:bCs/>
-          <w:iCs/>
-          <w:sz w:val="20"/>
-          <w:szCs w:val="20"/>
-        </w:rPr>
-        <w:t>procedures</w:t>
-      </w:r>
-      <w:proofErr w:type="spellEnd"/>
-      <w:r>
-        <w:rPr>
-          <w:rFonts w:ascii="Tahoma" w:eastAsia="Tahoma" w:hAnsi="Tahoma" w:cs="Tahoma"/>
-          <w:bCs/>
-          <w:iCs/>
-          <w:sz w:val="20"/>
-          <w:szCs w:val="20"/>
-        </w:rPr>
-        <w:t xml:space="preserve"> y </w:t>
-      </w:r>
-      <w:proofErr w:type="spellStart"/>
-      <w:r>
-        <w:rPr>
-          <w:rFonts w:ascii="Tahoma" w:eastAsia="Tahoma" w:hAnsi="Tahoma" w:cs="Tahoma"/>
-          <w:bCs/>
-          <w:iCs/>
-          <w:sz w:val="20"/>
-          <w:szCs w:val="20"/>
-        </w:rPr>
-        <w:t>packages</w:t>
-      </w:r>
-      <w:proofErr w:type="spellEnd"/>
-      <w:r>
-        <w:rPr>
-          <w:rFonts w:ascii="Tahoma" w:eastAsia="Tahoma" w:hAnsi="Tahoma" w:cs="Tahoma"/>
-          <w:bCs/>
-          <w:iCs/>
-          <w:sz w:val="20"/>
-          <w:szCs w:val="20"/>
-        </w:rPr>
-        <w:t xml:space="preserve"> para encapsular lógica de negocio compleja.</w:t>
-      </w:r>
-    </w:p>
-    <w:p>
-      <w:pPr>
-        <w:pStyle w:val="Prrafodelista"/>
-        <w:numPr>
-          <w:ilvl w:val="0"/>
-          <w:numId w:val="10"/>
-        </w:numPr>
-        <w:rPr>
-          <w:rFonts w:ascii="Tahoma" w:eastAsia="Tahoma" w:hAnsi="Tahoma" w:cs="Tahoma"/>
-          <w:bCs/>
-          <w:iCs/>
-          <w:sz w:val="20"/>
-          <w:szCs w:val="20"/>
-        </w:rPr>
-      </w:pPr>
-      <w:r>
-        <w:rPr>
-          <w:rFonts w:ascii="Tahoma" w:eastAsia="Tahoma" w:hAnsi="Tahoma" w:cs="Tahoma"/>
-          <w:bCs/>
-          <w:iCs/>
-          <w:sz w:val="20"/>
-          <w:szCs w:val="20"/>
-        </w:rPr>
-        <w:t xml:space="preserve">Construcción de vistas y flujos de usuario en Angular, integrando servicios HTTP y manejo reactivo de estado con </w:t>
-      </w:r>
-      <w:proofErr w:type="spellStart"/>
-      <w:r>
-        <w:rPr>
-          <w:rFonts w:ascii="Tahoma" w:eastAsia="Tahoma" w:hAnsi="Tahoma" w:cs="Tahoma"/>
-          <w:bCs/>
-          <w:iCs/>
-          <w:sz w:val="20"/>
-          <w:szCs w:val="20"/>
-        </w:rPr>
-        <w:t>RxJS</w:t>
-      </w:r>
-      <w:proofErr w:type="spellEnd"/>
-      <w:r>
-        <w:rPr>
-          <w:rFonts w:ascii="Tahoma" w:eastAsia="Tahoma" w:hAnsi="Tahoma" w:cs="Tahoma"/>
-          <w:bCs/>
-          <w:iCs/>
-          <w:sz w:val="20"/>
-          <w:szCs w:val="20"/>
-        </w:rPr>
-        <w:t>.</w:t>
-      </w:r>
-    </w:p>
-    <w:p>
-      <w:pPr>
-        <w:pStyle w:val="Prrafodelista"/>
-        <w:numPr>
-          <w:ilvl w:val="0"/>
-          <w:numId w:val="10"/>
-        </w:numPr>
-        <w:rPr>
-          <w:rFonts w:ascii="Tahoma" w:eastAsia="Tahoma" w:hAnsi="Tahoma" w:cs="Tahoma"/>
-          <w:bCs/>
-          <w:iCs/>
-          <w:sz w:val="20"/>
-          <w:szCs w:val="20"/>
-        </w:rPr>
-      </w:pPr>
-      <w:r>
-        <w:rPr>
-          <w:rFonts w:ascii="Tahoma" w:eastAsia="Tahoma" w:hAnsi="Tahoma" w:cs="Tahoma"/>
-          <w:bCs/>
-          <w:iCs/>
-          <w:sz w:val="20"/>
-          <w:szCs w:val="20"/>
-        </w:rPr>
-        <w:t xml:space="preserve">Implementación de capas de acceso a datos con llamadas a </w:t>
-      </w:r>
-      <w:proofErr w:type="spellStart"/>
-      <w:r>
-        <w:rPr>
-          <w:rFonts w:ascii="Tahoma" w:eastAsia="Tahoma" w:hAnsi="Tahoma" w:cs="Tahoma"/>
-          <w:bCs/>
-          <w:iCs/>
-          <w:sz w:val="20"/>
-          <w:szCs w:val="20"/>
-        </w:rPr>
-        <w:t>procedures</w:t>
-      </w:r>
-      <w:proofErr w:type="spellEnd"/>
-      <w:r>
-        <w:rPr>
-          <w:rFonts w:ascii="Tahoma" w:eastAsia="Tahoma" w:hAnsi="Tahoma" w:cs="Tahoma"/>
-          <w:bCs/>
-          <w:iCs/>
-          <w:sz w:val="20"/>
-          <w:szCs w:val="20"/>
-        </w:rPr>
-        <w:t xml:space="preserve"> Oracle, garantizando trazabilidad y separación de responsabilidades.</w:t>
-      </w:r>
-    </w:p>
-    <w:p>
-      <w:pPr>
-        <w:pStyle w:val="Prrafodelista"/>
-        <w:numPr>
-          <w:ilvl w:val="0"/>
-          <w:numId w:val="10"/>
-        </w:numPr>
-        <w:rPr>
-          <w:rFonts w:ascii="Tahoma" w:eastAsia="Tahoma" w:hAnsi="Tahoma" w:cs="Tahoma"/>
-          <w:bCs/>
-          <w:iCs/>
-          <w:sz w:val="20"/>
-          <w:szCs w:val="20"/>
-        </w:rPr>
-      </w:pPr>
-      <w:r>
-        <w:rPr>
-          <w:rFonts w:ascii="Tahoma" w:eastAsia="Tahoma" w:hAnsi="Tahoma" w:cs="Tahoma"/>
-          <w:bCs/>
-          <w:iCs/>
-          <w:sz w:val="20"/>
-          <w:szCs w:val="20"/>
-        </w:rPr>
-        <w:t>Colaboración en ciclos ágiles, participando en revisión de requerimientos funcionales y entrega continua de módulos al equipo.</w:t>
       </w:r>
     </w:p>
     <w:p>
@@ -1851,7 +1445,6 @@
     <w:p>
       <w:pPr>
         <w:pStyle w:val="Prrafodelista"/>
-        <w:widowControl w:val="0"/>
         <w:numPr>
           <w:ilvl w:val="0"/>
           <w:numId w:val="10"/>
@@ -1872,6 +1465,121 @@
           <w:sz w:val="20"/>
           <w:szCs w:val="20"/>
         </w:rPr>
+        <w:t xml:space="preserve">Desarrollo AI-First: uso de GitHub </w:t>
+      </w:r>
+      <w:proofErr w:type="spellStart"/>
+      <w:r>
+        <w:rPr>
+          <w:rFonts w:ascii="Tahoma" w:eastAsia="Tahoma" w:hAnsi="Tahoma" w:cs="Tahoma"/>
+          <w:bCs/>
+          <w:iCs/>
+          <w:sz w:val="20"/>
+          <w:szCs w:val="20"/>
+        </w:rPr>
+        <w:t>Copilot</w:t>
+      </w:r>
+      <w:proofErr w:type="spellEnd"/>
+      <w:r>
+        <w:rPr>
+          <w:rFonts w:ascii="Tahoma" w:eastAsia="Tahoma" w:hAnsi="Tahoma" w:cs="Tahoma"/>
+          <w:bCs/>
+          <w:iCs/>
+          <w:sz w:val="20"/>
+          <w:szCs w:val="20"/>
+        </w:rPr>
+        <w:t xml:space="preserve"> y flujos </w:t>
+      </w:r>
+      <w:proofErr w:type="spellStart"/>
+      <w:r>
+        <w:rPr>
+          <w:rFonts w:ascii="Tahoma" w:eastAsia="Tahoma" w:hAnsi="Tahoma" w:cs="Tahoma"/>
+          <w:bCs/>
+          <w:iCs/>
+          <w:sz w:val="20"/>
+          <w:szCs w:val="20"/>
+        </w:rPr>
+        <w:t>spec-driven</w:t>
+      </w:r>
+      <w:proofErr w:type="spellEnd"/>
+      <w:r>
+        <w:rPr>
+          <w:rFonts w:ascii="Tahoma" w:eastAsia="Tahoma" w:hAnsi="Tahoma" w:cs="Tahoma"/>
+          <w:bCs/>
+          <w:iCs/>
+          <w:sz w:val="20"/>
+          <w:szCs w:val="20"/>
+        </w:rPr>
+        <w:t xml:space="preserve"> con </w:t>
+      </w:r>
+      <w:proofErr w:type="spellStart"/>
+      <w:r>
+        <w:rPr>
+          <w:rFonts w:ascii="Tahoma" w:eastAsia="Tahoma" w:hAnsi="Tahoma" w:cs="Tahoma"/>
+          <w:bCs/>
+          <w:iCs/>
+          <w:sz w:val="20"/>
+          <w:szCs w:val="20"/>
+        </w:rPr>
+        <w:t>OpenSpec</w:t>
+      </w:r>
+      <w:proofErr w:type="spellEnd"/>
+      <w:r>
+        <w:rPr>
+          <w:rFonts w:ascii="Tahoma" w:eastAsia="Tahoma" w:hAnsi="Tahoma" w:cs="Tahoma"/>
+          <w:bCs/>
+          <w:iCs/>
+          <w:sz w:val="20"/>
+          <w:szCs w:val="20"/>
+        </w:rPr>
+        <w:t xml:space="preserve"> para acelerar la generación de código y la especificación de </w:t>
+      </w:r>
+      <w:proofErr w:type="spellStart"/>
+      <w:r>
+        <w:rPr>
+          <w:rFonts w:ascii="Tahoma" w:eastAsia="Tahoma" w:hAnsi="Tahoma" w:cs="Tahoma"/>
+          <w:bCs/>
+          <w:iCs/>
+          <w:sz w:val="20"/>
+          <w:szCs w:val="20"/>
+        </w:rPr>
+        <w:t>features</w:t>
+      </w:r>
+      <w:proofErr w:type="spellEnd"/>
+      <w:r>
+        <w:rPr>
+          <w:rFonts w:ascii="Tahoma" w:eastAsia="Tahoma" w:hAnsi="Tahoma" w:cs="Tahoma"/>
+          <w:bCs/>
+          <w:iCs/>
+          <w:sz w:val="20"/>
+          <w:szCs w:val="20"/>
+        </w:rPr>
+        <w:t>.</w:t>
+      </w:r>
+    </w:p>
+    <w:p>
+      <w:pPr>
+        <w:pStyle w:val="Prrafodelista"/>
+        <w:widowControl w:val="0"/>
+        <w:numPr>
+          <w:ilvl w:val="0"/>
+          <w:numId w:val="10"/>
+        </w:numPr>
+        <w:rPr>
+          <w:rFonts w:ascii="Tahoma" w:eastAsia="Tahoma" w:hAnsi="Tahoma" w:cs="Tahoma"/>
+          <w:bCs/>
+          <w:iCs/>
+          <w:sz w:val="20"/>
+          <w:szCs w:val="20"/>
+        </w:rPr>
+      </w:pPr>
+      <w:r>
+        <w:rPr>
+          <w:rFonts w:ascii="Tahoma" w:eastAsia="Tahoma" w:hAnsi="Tahoma" w:cs="Tahoma"/>
+          <w:bCs/>
+          <w:iCs/>
+          <w:sz w:val="20"/>
+          <w:szCs w:val="20"/>
+        </w:rPr>
         <w:t xml:space="preserve">Diseño de </w:t>
       </w:r>
       <w:proofErr w:type="spellStart"/>
@@ -2091,6 +1799,424 @@
           <w:szCs w:val="20"/>
         </w:rPr>
         <w:t xml:space="preserve"> y Grafana.</w:t>
+      </w:r>
+    </w:p>
+    <w:p>
+      <w:pPr>
+        <w:widowControl w:val="0"/>
+        <w:rPr>
+          <w:rFonts w:ascii="Tahoma" w:eastAsia="Tahoma" w:hAnsi="Tahoma"/>
+          <w:bCs/>
+          <w:iCs/>
+        </w:rPr>
+      </w:pPr>
+    </w:p>
+    <w:p>
+      <w:pPr>
+        <w:widowControl w:val="0"/>
+        <w:rPr>
+          <w:rFonts w:ascii="Tahoma" w:eastAsia="Tahoma" w:hAnsi="Tahoma" w:cs="Tahoma"/>
+          <w:b/>
+          <w:iCs/>
+          <w:sz w:val="20"/>
+          <w:szCs w:val="20"/>
+        </w:rPr>
+      </w:pPr>
+      <w:r>
+        <w:rPr>
+          <w:rFonts w:ascii="Tahoma" w:eastAsia="Tahoma" w:hAnsi="Tahoma" w:cs="Tahoma"/>
+          <w:b/>
+          <w:iCs/>
+          <w:sz w:val="20"/>
+          <w:szCs w:val="20"/>
+        </w:rPr>
+        <w:t>JNE</w:t>
+      </w:r>
+      <w:r>
+        <w:rPr>
+          <w:rFonts w:ascii="Tahoma" w:eastAsia="Tahoma" w:hAnsi="Tahoma" w:cs="Tahoma"/>
+          <w:b/>
+          <w:iCs/>
+          <w:sz w:val="20"/>
+          <w:szCs w:val="20"/>
+        </w:rPr>
+        <w:t>, Lima, Perú</w:t>
+      </w:r>
+    </w:p>
+    <w:p>
+      <w:pPr>
+        <w:widowControl w:val="0"/>
+        <w:rPr>
+          <w:rFonts w:ascii="Tahoma" w:eastAsia="Tahoma" w:hAnsi="Tahoma" w:cs="Tahoma"/>
+          <w:b/>
+          <w:bCs/>
+          <w:iCs/>
+          <w:sz w:val="20"/>
+          <w:szCs w:val="20"/>
+          <w:lang w:val="es-PE"/>
+        </w:rPr>
+      </w:pPr>
+      <w:r>
+        <w:rPr>
+          <w:rFonts w:ascii="Tahoma" w:eastAsia="Tahoma" w:hAnsi="Tahoma" w:cs="Tahoma"/>
+          <w:b/>
+          <w:bCs/>
+          <w:iCs/>
+          <w:sz w:val="20"/>
+          <w:szCs w:val="20"/>
+          <w:lang w:val="es-PE"/>
+        </w:rPr>
+        <w:t xml:space="preserve">Full Stack </w:t>
+      </w:r>
+      <w:proofErr w:type="spellStart"/>
+      <w:r>
+        <w:rPr>
+          <w:rFonts w:ascii="Tahoma" w:eastAsia="Tahoma" w:hAnsi="Tahoma" w:cs="Tahoma"/>
+          <w:b/>
+          <w:bCs/>
+          <w:iCs/>
+          <w:sz w:val="20"/>
+          <w:szCs w:val="20"/>
+          <w:lang w:val="es-PE"/>
+        </w:rPr>
+        <w:t>Developer</w:t>
+      </w:r>
+      <w:proofErr w:type="spellEnd"/>
+      <w:r>
+        <w:rPr>
+          <w:rFonts w:ascii="Tahoma" w:eastAsia="Tahoma" w:hAnsi="Tahoma" w:cs="Tahoma"/>
+          <w:b/>
+          <w:bCs/>
+          <w:iCs/>
+          <w:sz w:val="20"/>
+          <w:szCs w:val="20"/>
+          <w:lang w:val="es-PE"/>
+        </w:rPr>
+        <w:t xml:space="preserve"> .Net / Angular</w:t>
+      </w:r>
+      <w:r>
+        <w:rPr>
+          <w:rFonts w:ascii="Tahoma" w:eastAsia="Tahoma" w:hAnsi="Tahoma" w:cs="Tahoma"/>
+          <w:bCs/>
+          <w:iCs/>
+          <w:sz w:val="20"/>
+          <w:szCs w:val="20"/>
+        </w:rPr>
+        <w:t xml:space="preserve">                    </w:t>
+      </w:r>
+      <w:r>
+        <w:rPr>
+          <w:rFonts w:ascii="Tahoma" w:eastAsia="Tahoma" w:hAnsi="Tahoma" w:cs="Tahoma"/>
+          <w:bCs/>
+          <w:iCs/>
+          <w:sz w:val="20"/>
+          <w:szCs w:val="20"/>
+        </w:rPr>
+        <w:t xml:space="preserve">                           noviembre</w:t>
+      </w:r>
+      <w:r>
+        <w:rPr>
+          <w:rFonts w:ascii="Tahoma" w:eastAsia="Tahoma" w:hAnsi="Tahoma" w:cs="Tahoma"/>
+          <w:bCs/>
+          <w:iCs/>
+          <w:sz w:val="20"/>
+          <w:szCs w:val="20"/>
+        </w:rPr>
+        <w:t xml:space="preserve"> 2025 – </w:t>
+      </w:r>
+      <w:r>
+        <w:rPr>
+          <w:rFonts w:ascii="Tahoma" w:eastAsia="Tahoma" w:hAnsi="Tahoma" w:cs="Tahoma"/>
+          <w:bCs/>
+          <w:iCs/>
+          <w:sz w:val="20"/>
+          <w:szCs w:val="20"/>
+        </w:rPr>
+        <w:t>agosto 2026</w:t>
+      </w:r>
+    </w:p>
+    <w:p>
+      <w:pPr>
+        <w:pStyle w:val="Prrafodelista"/>
+        <w:numPr>
+          <w:ilvl w:val="0"/>
+          <w:numId w:val="10"/>
+        </w:numPr>
+        <w:rPr>
+          <w:rFonts w:ascii="Tahoma" w:eastAsia="Tahoma" w:hAnsi="Tahoma" w:cs="Tahoma"/>
+          <w:bCs/>
+          <w:iCs/>
+          <w:sz w:val="20"/>
+          <w:szCs w:val="20"/>
+        </w:rPr>
+      </w:pPr>
+      <w:r>
+        <w:rPr>
+          <w:rFonts w:ascii="Tahoma" w:eastAsia="Tahoma" w:hAnsi="Tahoma" w:cs="Tahoma"/>
+          <w:bCs/>
+          <w:iCs/>
+          <w:sz w:val="20"/>
+          <w:szCs w:val="20"/>
+        </w:rPr>
+        <w:t xml:space="preserve">Desarrollo de </w:t>
+      </w:r>
+      <w:proofErr w:type="spellStart"/>
+      <w:r>
+        <w:rPr>
+          <w:rFonts w:ascii="Tahoma" w:eastAsia="Tahoma" w:hAnsi="Tahoma" w:cs="Tahoma"/>
+          <w:bCs/>
+          <w:iCs/>
+          <w:sz w:val="20"/>
+          <w:szCs w:val="20"/>
+        </w:rPr>
+        <w:t>APIs</w:t>
+      </w:r>
+      <w:proofErr w:type="spellEnd"/>
+      <w:r>
+        <w:rPr>
+          <w:rFonts w:ascii="Tahoma" w:eastAsia="Tahoma" w:hAnsi="Tahoma" w:cs="Tahoma"/>
+          <w:bCs/>
+          <w:iCs/>
+          <w:sz w:val="20"/>
+          <w:szCs w:val="20"/>
+        </w:rPr>
+        <w:t xml:space="preserve"> </w:t>
+      </w:r>
+      <w:proofErr w:type="spellStart"/>
+      <w:r>
+        <w:rPr>
+          <w:rFonts w:ascii="Tahoma" w:eastAsia="Tahoma" w:hAnsi="Tahoma" w:cs="Tahoma"/>
+          <w:bCs/>
+          <w:iCs/>
+          <w:sz w:val="20"/>
+          <w:szCs w:val="20"/>
+        </w:rPr>
+        <w:t>RESTful</w:t>
+      </w:r>
+      <w:proofErr w:type="spellEnd"/>
+      <w:r>
+        <w:rPr>
+          <w:rFonts w:ascii="Tahoma" w:eastAsia="Tahoma" w:hAnsi="Tahoma" w:cs="Tahoma"/>
+          <w:bCs/>
+          <w:iCs/>
+          <w:sz w:val="20"/>
+          <w:szCs w:val="20"/>
+        </w:rPr>
+        <w:t xml:space="preserve"> con .NET Framework, exponiendo servicios consumidos por módulos Angular con arquitectura por componentes.</w:t>
+      </w:r>
+    </w:p>
+    <w:p>
+      <w:pPr>
+        <w:pStyle w:val="Prrafodelista"/>
+        <w:numPr>
+          <w:ilvl w:val="0"/>
+          <w:numId w:val="10"/>
+        </w:numPr>
+        <w:rPr>
+          <w:rFonts w:ascii="Tahoma" w:eastAsia="Tahoma" w:hAnsi="Tahoma" w:cs="Tahoma"/>
+          <w:bCs/>
+          <w:iCs/>
+          <w:sz w:val="20"/>
+          <w:szCs w:val="20"/>
+        </w:rPr>
+      </w:pPr>
+      <w:r>
+        <w:rPr>
+          <w:rFonts w:ascii="Tahoma" w:eastAsia="Tahoma" w:hAnsi="Tahoma" w:cs="Tahoma"/>
+          <w:bCs/>
+          <w:iCs/>
+          <w:sz w:val="20"/>
+          <w:szCs w:val="20"/>
+        </w:rPr>
+        <w:t xml:space="preserve">Modelado y administración de base de datos Oracle: diseño de esquemas, </w:t>
+      </w:r>
+      <w:proofErr w:type="spellStart"/>
+      <w:r>
+        <w:rPr>
+          <w:rFonts w:ascii="Tahoma" w:eastAsia="Tahoma" w:hAnsi="Tahoma" w:cs="Tahoma"/>
+          <w:bCs/>
+          <w:iCs/>
+          <w:sz w:val="20"/>
+          <w:szCs w:val="20"/>
+        </w:rPr>
+        <w:t>stored</w:t>
+      </w:r>
+      <w:proofErr w:type="spellEnd"/>
+      <w:r>
+        <w:rPr>
+          <w:rFonts w:ascii="Tahoma" w:eastAsia="Tahoma" w:hAnsi="Tahoma" w:cs="Tahoma"/>
+          <w:bCs/>
+          <w:iCs/>
+          <w:sz w:val="20"/>
+          <w:szCs w:val="20"/>
+        </w:rPr>
+        <w:t xml:space="preserve"> </w:t>
+      </w:r>
+      <w:proofErr w:type="spellStart"/>
+      <w:r>
+        <w:rPr>
+          <w:rFonts w:ascii="Tahoma" w:eastAsia="Tahoma" w:hAnsi="Tahoma" w:cs="Tahoma"/>
+          <w:bCs/>
+          <w:iCs/>
+          <w:sz w:val="20"/>
+          <w:szCs w:val="20"/>
+        </w:rPr>
+        <w:t>procedures</w:t>
+      </w:r>
+      <w:proofErr w:type="spellEnd"/>
+      <w:r>
+        <w:rPr>
+          <w:rFonts w:ascii="Tahoma" w:eastAsia="Tahoma" w:hAnsi="Tahoma" w:cs="Tahoma"/>
+          <w:bCs/>
+          <w:iCs/>
+          <w:sz w:val="20"/>
+          <w:szCs w:val="20"/>
+        </w:rPr>
+        <w:t xml:space="preserve"> y </w:t>
+      </w:r>
+      <w:proofErr w:type="spellStart"/>
+      <w:r>
+        <w:rPr>
+          <w:rFonts w:ascii="Tahoma" w:eastAsia="Tahoma" w:hAnsi="Tahoma" w:cs="Tahoma"/>
+          <w:bCs/>
+          <w:iCs/>
+          <w:sz w:val="20"/>
+          <w:szCs w:val="20"/>
+        </w:rPr>
+        <w:t>packages</w:t>
+      </w:r>
+      <w:proofErr w:type="spellEnd"/>
+      <w:r>
+        <w:rPr>
+          <w:rFonts w:ascii="Tahoma" w:eastAsia="Tahoma" w:hAnsi="Tahoma" w:cs="Tahoma"/>
+          <w:bCs/>
+          <w:iCs/>
+          <w:sz w:val="20"/>
+          <w:szCs w:val="20"/>
+        </w:rPr>
+        <w:t xml:space="preserve"> para encapsular lógica de negocio compleja.</w:t>
+      </w:r>
+    </w:p>
+    <w:p>
+      <w:pPr>
+        <w:pStyle w:val="Prrafodelista"/>
+        <w:numPr>
+          <w:ilvl w:val="0"/>
+          <w:numId w:val="10"/>
+        </w:numPr>
+        <w:rPr>
+          <w:rFonts w:ascii="Tahoma" w:eastAsia="Tahoma" w:hAnsi="Tahoma" w:cs="Tahoma"/>
+          <w:bCs/>
+          <w:iCs/>
+          <w:sz w:val="20"/>
+          <w:szCs w:val="20"/>
+        </w:rPr>
+      </w:pPr>
+      <w:r>
+        <w:rPr>
+          <w:rFonts w:ascii="Tahoma" w:eastAsia="Tahoma" w:hAnsi="Tahoma" w:cs="Tahoma"/>
+          <w:bCs/>
+          <w:iCs/>
+          <w:sz w:val="20"/>
+          <w:szCs w:val="20"/>
+        </w:rPr>
+        <w:t xml:space="preserve">Construcción de vistas y flujos de usuario en Angular, integrando servicios HTTP y manejo reactivo de estado con </w:t>
+      </w:r>
+      <w:proofErr w:type="spellStart"/>
+      <w:r>
+        <w:rPr>
+          <w:rFonts w:ascii="Tahoma" w:eastAsia="Tahoma" w:hAnsi="Tahoma" w:cs="Tahoma"/>
+          <w:bCs/>
+          <w:iCs/>
+          <w:sz w:val="20"/>
+          <w:szCs w:val="20"/>
+        </w:rPr>
+        <w:t>RxJS</w:t>
+      </w:r>
+      <w:proofErr w:type="spellEnd"/>
+      <w:r>
+        <w:rPr>
+          <w:rFonts w:ascii="Tahoma" w:eastAsia="Tahoma" w:hAnsi="Tahoma" w:cs="Tahoma"/>
+          <w:bCs/>
+          <w:iCs/>
+          <w:sz w:val="20"/>
+          <w:szCs w:val="20"/>
+        </w:rPr>
+        <w:t>.</w:t>
+      </w:r>
+    </w:p>
+    <w:p>
+      <w:pPr>
+        <w:pStyle w:val="Prrafodelista"/>
+        <w:numPr>
+          <w:ilvl w:val="0"/>
+          <w:numId w:val="10"/>
+        </w:numPr>
+        <w:rPr>
+          <w:rFonts w:ascii="Tahoma" w:eastAsia="Tahoma" w:hAnsi="Tahoma" w:cs="Tahoma"/>
+          <w:bCs/>
+          <w:iCs/>
+          <w:sz w:val="20"/>
+          <w:szCs w:val="20"/>
+        </w:rPr>
+      </w:pPr>
+      <w:r>
+        <w:rPr>
+          <w:rFonts w:ascii="Tahoma" w:eastAsia="Tahoma" w:hAnsi="Tahoma" w:cs="Tahoma"/>
+          <w:bCs/>
+          <w:iCs/>
+          <w:sz w:val="20"/>
+          <w:szCs w:val="20"/>
+        </w:rPr>
+        <w:t xml:space="preserve">Implementación de capas de acceso a datos con llamadas a </w:t>
+      </w:r>
+      <w:proofErr w:type="spellStart"/>
+      <w:r>
+        <w:rPr>
+          <w:rFonts w:ascii="Tahoma" w:eastAsia="Tahoma" w:hAnsi="Tahoma" w:cs="Tahoma"/>
+          <w:bCs/>
+          <w:iCs/>
+          <w:sz w:val="20"/>
+          <w:szCs w:val="20"/>
+        </w:rPr>
+        <w:t>procedures</w:t>
+      </w:r>
+      <w:proofErr w:type="spellEnd"/>
+      <w:r>
+        <w:rPr>
+          <w:rFonts w:ascii="Tahoma" w:eastAsia="Tahoma" w:hAnsi="Tahoma" w:cs="Tahoma"/>
+          <w:bCs/>
+          <w:iCs/>
+          <w:sz w:val="20"/>
+          <w:szCs w:val="20"/>
+        </w:rPr>
+        <w:t xml:space="preserve"> Oracle, garantizando trazabilidad y separación de responsabilidades.</w:t>
+      </w:r>
+    </w:p>
+    <w:p>
+      <w:pPr>
+        <w:pStyle w:val="Prrafodelista"/>
+        <w:numPr>
+          <w:ilvl w:val="0"/>
+          <w:numId w:val="10"/>
+        </w:numPr>
+        <w:rPr>
+          <w:rFonts w:ascii="Tahoma" w:eastAsia="Tahoma" w:hAnsi="Tahoma" w:cs="Tahoma"/>
+          <w:bCs/>
+          <w:iCs/>
+          <w:sz w:val="20"/>
+          <w:szCs w:val="20"/>
+        </w:rPr>
+      </w:pPr>
+      <w:r>
+        <w:rPr>
+          <w:rFonts w:ascii="Tahoma" w:eastAsia="Tahoma" w:hAnsi="Tahoma" w:cs="Tahoma"/>
+          <w:bCs/>
+          <w:iCs/>
+          <w:sz w:val="20"/>
+          <w:szCs w:val="20"/>
+        </w:rPr>
+        <w:t>Colaboración en ciclos ágiles, participando en revisión de requerimientos funcionales y entrega continua de módulos al equipo.</w:t>
       </w:r>
     </w:p>
     <w:p>
@@ -2908,6 +3034,8 @@
       <w:r>
         <w:rPr>
           <w:rFonts w:ascii="Tahoma" w:eastAsia="Tahoma" w:hAnsi="Tahoma" w:cs="Tahoma"/>
+          <w:b/>
+          <w:bCs/>
           <w:iCs/>
           <w:sz w:val="20"/>
           <w:szCs w:val="20"/>
@@ -3556,29 +3684,7 @@
           <w:sz w:val="20"/>
           <w:szCs w:val="20"/>
         </w:rPr>
-        <w:t xml:space="preserve">Implementación de manejo centralizado de errores y notificaciones automáticas vía </w:t>
-      </w:r>
-      <w:proofErr w:type="spellStart"/>
-      <w:r>
-        <w:rPr>
-          <w:rFonts w:ascii="Tahoma" w:eastAsia="Tahoma" w:hAnsi="Tahoma" w:cs="Tahoma"/>
-          <w:bCs/>
-          <w:iCs/>
-          <w:sz w:val="20"/>
-          <w:szCs w:val="20"/>
-        </w:rPr>
-        <w:t>Telegram</w:t>
-      </w:r>
-      <w:proofErr w:type="spellEnd"/>
-      <w:r>
-        <w:rPr>
-          <w:rFonts w:ascii="Tahoma" w:eastAsia="Tahoma" w:hAnsi="Tahoma" w:cs="Tahoma"/>
-          <w:bCs/>
-          <w:iCs/>
-          <w:sz w:val="20"/>
-          <w:szCs w:val="20"/>
-        </w:rPr>
-        <w:t xml:space="preserve"> para monitoreo y respuesta temprana ante incidencias.</w:t>
+        <w:t>Implementación de manejo centralizado de errores y notificaciones automáticas vía Telegram para monitoreo y respuesta temprana ante incidencias.</w:t>
       </w:r>
     </w:p>
     <w:p>
@@ -6112,6 +6218,17 @@
         </w:rPr>
         <w:t xml:space="preserve"> de Base de Datos – KB SOLUCIONES</w:t>
       </w:r>
+    </w:p>
+    <w:p>
+      <w:pPr>
+        <w:rPr>
+          <w:rFonts w:ascii="Tahoma" w:eastAsia="Tahoma" w:hAnsi="Tahoma"/>
+          <w:bCs/>
+          <w:sz w:val="20"/>
+          <w:szCs w:val="20"/>
+          <w:lang w:val="en-US"/>
+        </w:rPr>
+      </w:pPr>
     </w:p>
     <w:p>
       <w:pPr>
@@ -8807,28 +8924,28 @@
 </file>
 
 <file path=customXml/item1.xml><?xml version="1.0" encoding="utf-8"?>
-<b:Sources xmlns:b="http://schemas.openxmlformats.org/officeDocument/2006/bibliography" xmlns="http://schemas.openxmlformats.org/officeDocument/2006/bibliography" SelectedStyle="\APASixthEditionOfficeOnline.xsl" StyleName="APA" Version="6"/>
-</file>
-
-<file path=customXml/item2.xml><?xml version="1.0" encoding="utf-8"?>
 <go:gDocsCustomXmlDataStorage xmlns:go="http://customooxmlschemas.google.com/" xmlns:r="http://schemas.openxmlformats.org/officeDocument/2006/relationships">
   <go:docsCustomData xmlns:go="http://customooxmlschemas.google.com/" roundtripDataSignature="AMtx7mjmV547DBb5W7Vj4FBv8CKBPVZeBQ==">AMUW2mWCnEoq0whr/h3grsUUucO31areDnYaPbVHryvHCMSDHnD9IqvSqaFhuHCJbRUO4HvDgiuc5+4rCLqkPY3YYgWbTB+XjWC21WidzHoc2yzsJdLzDto=</go:docsCustomData>
 </go:gDocsCustomXmlDataStorage>
 </file>
 
-<file path=customXml/itemProps1.xml><?xml version="1.0" encoding="utf-8"?>
-<ds:datastoreItem xmlns:ds="http://schemas.openxmlformats.org/officeDocument/2006/customXml" ds:itemID="{7A826A98-B2CA-41AA-BC40-587C4EC17068}">
-  <ds:schemaRefs>
-    <ds:schemaRef ds:uri="http://schemas.openxmlformats.org/officeDocument/2006/bibliography"/>
-  </ds:schemaRefs>
-</ds:datastoreItem>
+<file path=customXml/item2.xml><?xml version="1.0" encoding="utf-8"?>
+<b:Sources xmlns:b="http://schemas.openxmlformats.org/officeDocument/2006/bibliography" xmlns="http://schemas.openxmlformats.org/officeDocument/2006/bibliography" SelectedStyle="\APASixthEditionOfficeOnline.xsl" StyleName="APA" Version="6"/>
 </file>
 
-<file path=customXml/itemProps2.xml><?xml version="1.0" encoding="utf-8"?>
+<file path=customXml/itemProps1.xml><?xml version="1.0" encoding="utf-8"?>
 <ds:datastoreItem xmlns:ds="http://schemas.openxmlformats.org/officeDocument/2006/customXml" ds:itemID="{11111111-1234-1234-1234-123412341234}">
   <ds:schemaRefs>
     <ds:schemaRef ds:uri="http://customooxmlschemas.google.com/"/>
     <ds:schemaRef ds:uri="http://schemas.openxmlformats.org/officeDocument/2006/relationships"/>
   </ds:schemaRefs>
 </ds:datastoreItem>
+</file>
+
+<file path=customXml/itemProps2.xml><?xml version="1.0" encoding="utf-8"?>
+<ds:datastoreItem xmlns:ds="http://schemas.openxmlformats.org/officeDocument/2006/customXml" ds:itemID="{7A826A98-B2CA-41AA-BC40-587C4EC17068}">
+  <ds:schemaRefs>
+    <ds:schemaRef ds:uri="http://schemas.openxmlformats.org/officeDocument/2006/bibliography"/>
+  </ds:schemaRefs>
+</ds:datastoreItem>
 </file>
</xml_diff>